<commit_message>
docs(radar): regenerar los entregables con la evidencia del corte
Los .docx seguían en el estado anterior a la corrección de los
generadores. Se regeneran los tres para que el cliente lea las cifras
reales del corte (129 pruebas, 10 recorridos E2E, commit bbd704c) y no
las heredadas de un corte previo; la tira de métricas de la matriz aún
repetía "122 / 122" y "9 / 9".

Co-Authored-By: Claude Opus 5 (1M context) <noreply@anthropic.com>
</commit_message>
<xml_diff>
--- a/radar-mvp/output/docs/Matriz_Trazabilidad_Historias_Usuario_Radar_2026-07-25.docx
+++ b/radar-mvp/output/docs/Matriz_Trazabilidad_Historias_Usuario_Radar_2026-07-25.docx
@@ -204,7 +204,7 @@
                 <w:color w:val="2A1336"/>
                 <w:sz w:val="21"/>
               </w:rPr>
-              <w:t>e193049</w:t>
+              <w:t>bbd704c</w:t>
             </w:r>
           </w:p>
         </w:tc>
@@ -356,7 +356,7 @@
                 <w:color w:val="2A1336"/>
                 <w:sz w:val="32"/>
               </w:rPr>
-              <w:t>122 / 122</w:t>
+              <w:t>129 / 129</w:t>
             </w:r>
           </w:p>
           <w:p>
@@ -407,7 +407,7 @@
                 <w:color w:val="2A1336"/>
                 <w:sz w:val="32"/>
               </w:rPr>
-              <w:t>9 / 9</w:t>
+              <w:t>10 / 10</w:t>
             </w:r>
           </w:p>
           <w:p>
@@ -3486,7 +3486,7 @@
           <w:color w:val="2A1336"/>
           <w:sz w:val="22"/>
         </w:rPr>
-        <w:t>Registro por correo y acceso con Google OAuth probado.</w:t>
+        <w:t>Registro por correo y acceso con Google OAuth disponible; el proveedor externo se validó manualmente.</w:t>
       </w:r>
     </w:p>
     <w:p>
@@ -4046,7 +4046,7 @@
         <w:tc>
           <w:tcPr>
             <w:tcW w:type="dxa" w:w="1420"/>
-            <w:shd w:fill="EAF6EF" w:val="clear"/>
+            <w:shd w:fill="FFF5D6" w:val="clear"/>
           </w:tcPr>
           <w:p>
             <w:pPr>
@@ -4061,7 +4061,7 @@
                 <w:color w:val="2A1336"/>
                 <w:sz w:val="18"/>
               </w:rPr>
-              <w:t>Validado</w:t>
+              <w:t>Validado manualmente</w:t>
             </w:r>
           </w:p>
         </w:tc>
@@ -4478,7 +4478,7 @@
           <w:color w:val="2A1336"/>
           <w:sz w:val="22"/>
         </w:rPr>
-        <w:t>El flujo ya separa el mercado de venta del mercado de arriendo, almacena cánones mensuales, calcula una referencia de alquiler para propiedades similares y permite recalcular rentabilidad. El piloto controlado cubre Medellín —seis barrios—, Bucaramanga, Pereira y Manizales.</w:t>
+        <w:t>El flujo ya separa el mercado de venta del mercado de arriendo, almacena cánones mensuales, calcula una referencia de alquiler para propiedades similares y permite recalcular rentabilidad. El piloto controlado cubre Medellín, Bogotá, Cali, Barranquilla y Bucaramanga.</w:t>
       </w:r>
     </w:p>
     <w:p>
@@ -5637,7 +5637,7 @@
           <w:color w:val="2A1336"/>
           <w:sz w:val="22"/>
         </w:rPr>
-        <w:t>Pruebas unitarias e integración: 122 de 122 aprobadas.</w:t>
+        <w:t>Pruebas unitarias e integración: suite completa aprobada sin fallos en el corte.</w:t>
       </w:r>
     </w:p>
     <w:p>
@@ -5656,7 +5656,7 @@
           <w:color w:val="2A1336"/>
           <w:sz w:val="22"/>
         </w:rPr>
-        <w:t>Recorridos E2E locales: 9 de 9 aprobados.</w:t>
+        <w:t>Recorridos E2E locales: suite crítica aprobada sin fallos en el corte.</w:t>
       </w:r>
     </w:p>
     <w:p>
@@ -5675,7 +5675,7 @@
           <w:color w:val="2A1336"/>
           <w:sz w:val="22"/>
         </w:rPr>
-        <w:t>Cobertura E2E actual: dashboard/configuración, Bancos, Remates, rentabilidad con arriendos, guardados, login, Google OAuth, checkout demo, móvil y filtros laterales.</w:t>
+        <w:t>Cobertura E2E actual: dashboard/configuración, Bancos, Remates, rentabilidad con arriendos, guardados, login, disponibilidad del acceso con Google, checkout demo, móvil, filtros laterales y estados de carga.</w:t>
       </w:r>
     </w:p>
     <w:p>
@@ -5694,7 +5694,7 @@
           <w:color w:val="2A1336"/>
           <w:sz w:val="22"/>
         </w:rPr>
-        <w:t>Versión de código evaluada: e193049.</w:t>
+        <w:t>Versión de código evaluada: bbd704c.</w:t>
       </w:r>
     </w:p>
     <w:p>

</xml_diff>